<commit_message>
page and markdown naming
</commit_message>
<xml_diff>
--- a/documentation.docx
+++ b/documentation.docx
@@ -52,6 +52,174 @@
     </w:p>
     <w:p>
       <w:pPr>
+        <w:pBdr>
+          <w:bottom w:val="double" w:sz="6" w:space="1" w:color="auto"/>
+        </w:pBdr>
+        <w:rPr>
+          <w:rFonts w:ascii="Segoe UI Symbol" w:hAnsi="Segoe UI Symbol" w:cs="Segoe UI Symbol"/>
+          <w:b/>
+          <w:bCs/>
+          <w:lang w:val="en-US"/>
+        </w:rPr>
+      </w:pPr>
+    </w:p>
+    <w:p>
+      <w:pPr>
+        <w:rPr>
+          <w:rFonts w:ascii="Segoe UI Symbol" w:hAnsi="Segoe UI Symbol" w:cs="Segoe UI Symbol"/>
+          <w:b/>
+          <w:bCs/>
+          <w:lang w:val="en-US"/>
+        </w:rPr>
+      </w:pPr>
+      <w:r>
+        <w:rPr>
+          <w:rFonts w:ascii="Segoe UI Symbol" w:hAnsi="Segoe UI Symbol" w:cs="Segoe UI Symbol"/>
+          <w:b/>
+          <w:bCs/>
+          <w:lang w:val="en-US"/>
+        </w:rPr>
+        <w:t>DB_USER = "</w:t>
+      </w:r>
+      <w:proofErr w:type="spellStart"/>
+      <w:r>
+        <w:rPr>
+          <w:rFonts w:ascii="Segoe UI Symbol" w:hAnsi="Segoe UI Symbol" w:cs="Segoe UI Symbol"/>
+          <w:b/>
+          <w:bCs/>
+          <w:lang w:val="en-US"/>
+        </w:rPr>
+        <w:t>neondb_owner</w:t>
+      </w:r>
+      <w:proofErr w:type="spellEnd"/>
+      <w:r>
+        <w:rPr>
+          <w:rFonts w:ascii="Segoe UI Symbol" w:hAnsi="Segoe UI Symbol" w:cs="Segoe UI Symbol"/>
+          <w:b/>
+          <w:bCs/>
+          <w:lang w:val="en-US"/>
+        </w:rPr>
+        <w:t>"</w:t>
+      </w:r>
+    </w:p>
+    <w:p>
+      <w:pPr>
+        <w:rPr>
+          <w:rFonts w:ascii="Segoe UI Symbol" w:hAnsi="Segoe UI Symbol" w:cs="Segoe UI Symbol"/>
+          <w:b/>
+          <w:bCs/>
+          <w:lang w:val="en-US"/>
+        </w:rPr>
+      </w:pPr>
+      <w:r>
+        <w:rPr>
+          <w:rFonts w:ascii="Segoe UI Symbol" w:hAnsi="Segoe UI Symbol" w:cs="Segoe UI Symbol"/>
+          <w:b/>
+          <w:bCs/>
+          <w:lang w:val="en-US"/>
+        </w:rPr>
+        <w:t>DB_PASSWORD = "npg_KCUPAwfW0z2a"</w:t>
+      </w:r>
+    </w:p>
+    <w:p>
+      <w:pPr>
+        <w:rPr>
+          <w:rFonts w:ascii="Segoe UI Symbol" w:hAnsi="Segoe UI Symbol" w:cs="Segoe UI Symbol"/>
+          <w:b/>
+          <w:bCs/>
+          <w:lang w:val="en-US"/>
+        </w:rPr>
+      </w:pPr>
+      <w:r>
+        <w:rPr>
+          <w:rFonts w:ascii="Segoe UI Symbol" w:hAnsi="Segoe UI Symbol" w:cs="Segoe UI Symbol"/>
+          <w:b/>
+          <w:bCs/>
+          <w:lang w:val="en-US"/>
+        </w:rPr>
+        <w:t>DB_NAME = "</w:t>
+      </w:r>
+      <w:proofErr w:type="spellStart"/>
+      <w:r>
+        <w:rPr>
+          <w:rFonts w:ascii="Segoe UI Symbol" w:hAnsi="Segoe UI Symbol" w:cs="Segoe UI Symbol"/>
+          <w:b/>
+          <w:bCs/>
+          <w:lang w:val="en-US"/>
+        </w:rPr>
+        <w:t>downstream_logistics</w:t>
+      </w:r>
+      <w:proofErr w:type="spellEnd"/>
+      <w:r>
+        <w:rPr>
+          <w:rFonts w:ascii="Segoe UI Symbol" w:hAnsi="Segoe UI Symbol" w:cs="Segoe UI Symbol"/>
+          <w:b/>
+          <w:bCs/>
+          <w:lang w:val="en-US"/>
+        </w:rPr>
+        <w:t>"</w:t>
+      </w:r>
+    </w:p>
+    <w:p>
+      <w:pPr>
+        <w:rPr>
+          <w:rFonts w:ascii="Segoe UI Symbol" w:hAnsi="Segoe UI Symbol" w:cs="Segoe UI Symbol"/>
+          <w:b/>
+          <w:bCs/>
+          <w:lang w:val="en-US"/>
+        </w:rPr>
+      </w:pPr>
+      <w:r>
+        <w:rPr>
+          <w:rFonts w:ascii="Segoe UI Symbol" w:hAnsi="Segoe UI Symbol" w:cs="Segoe UI Symbol"/>
+          <w:b/>
+          <w:bCs/>
+          <w:lang w:val="en-US"/>
+        </w:rPr>
+        <w:t>DB_HOST = "</w:t>
+      </w:r>
+      <w:proofErr w:type="gramStart"/>
+      <w:r>
+        <w:rPr>
+          <w:rFonts w:ascii="Segoe UI Symbol" w:hAnsi="Segoe UI Symbol" w:cs="Segoe UI Symbol"/>
+          <w:b/>
+          <w:bCs/>
+          <w:lang w:val="en-US"/>
+        </w:rPr>
+        <w:t>ep-steep-bird-b4gr0jwz-pooler.c-6.us-east-2.aws.neon.tech</w:t>
+      </w:r>
+      <w:proofErr w:type="gramEnd"/>
+      <w:r>
+        <w:rPr>
+          <w:rFonts w:ascii="Segoe UI Symbol" w:hAnsi="Segoe UI Symbol" w:cs="Segoe UI Symbol"/>
+          <w:b/>
+          <w:bCs/>
+          <w:lang w:val="en-US"/>
+        </w:rPr>
+        <w:t>"</w:t>
+      </w:r>
+    </w:p>
+    <w:p>
+      <w:pPr>
+        <w:rPr>
+          <w:rFonts w:ascii="Segoe UI Symbol" w:hAnsi="Segoe UI Symbol" w:cs="Segoe UI Symbol"/>
+          <w:b/>
+          <w:bCs/>
+          <w:lang w:val="en-US"/>
+        </w:rPr>
+      </w:pPr>
+      <w:r>
+        <w:rPr>
+          <w:rFonts w:ascii="Segoe UI Symbol" w:hAnsi="Segoe UI Symbol" w:cs="Segoe UI Symbol"/>
+          <w:b/>
+          <w:bCs/>
+          <w:lang w:val="en-US"/>
+        </w:rPr>
+        <w:t>DB_PORT = "5432"</w:t>
+      </w:r>
+    </w:p>
+    <w:p>
+      <w:pPr>
         <w:rPr>
           <w:rFonts w:ascii="Segoe UI Symbol" w:hAnsi="Segoe UI Symbol" w:cs="Segoe UI Symbol"/>
           <w:b/>
@@ -253,7 +421,11 @@
         <w:t>Unscheduled Roadside Breakdowns:</w:t>
       </w:r>
       <w:r>
-        <w:t xml:space="preserve"> Heavy-duty product haulage assets are frequently run past safe mechanical operating limits due to human scheduling errors. When a truck carrying volatile refined products suffers an unexpected engine failure or transmission breakdown on a major transit corridor, it causes catastrophic supply chain delays, safety hazards, and steep SLA financial penalties.</w:t>
+        <w:t xml:space="preserve"> Heavy-duty product haulage assets are frequently run past safe mechanical operating limits due to human scheduling errors. When a truck carrying volatile refined products suffers an unexpected engine failure or </w:t>
+      </w:r>
+      <w:r>
+        <w:lastRenderedPageBreak/>
+        <w:t>transmission breakdown on a major transit corridor, it causes catastrophic supply chain delays, safety hazards, and steep SLA financial penalties.</w:t>
       </w:r>
     </w:p>
     <w:p>
@@ -338,7 +510,6 @@
                 <w:b/>
                 <w:bCs/>
               </w:rPr>
-              <w:lastRenderedPageBreak/>
               <w:t>Column Field Name</w:t>
             </w:r>
           </w:p>
@@ -1017,6 +1188,7 @@
                 <w:b/>
                 <w:bCs/>
               </w:rPr>
+              <w:lastRenderedPageBreak/>
               <w:t>Hours_Since_Service</w:t>
             </w:r>
           </w:p>
@@ -1248,7 +1420,6 @@
           <w:b/>
           <w:bCs/>
         </w:rPr>
-        <w:lastRenderedPageBreak/>
         <w:t>4. Core Business &amp; Machine Learning Logic</w:t>
       </w:r>
     </w:p>
@@ -1454,6 +1625,7 @@
           <w:b/>
           <w:bCs/>
         </w:rPr>
+        <w:lastRenderedPageBreak/>
         <w:t>The Probability Filter (random.random() &gt; 0.4):</w:t>
       </w:r>
       <w:r>
@@ -1538,7 +1710,6 @@
         <w:rPr>
           <w:lang w:val="en-US"/>
         </w:rPr>
-        <w:lastRenderedPageBreak/>
         <w:t>Think of your database like a security camera system for your trucks. Instead of video, your trucks send a digital text message to your database every 4 hours containing their speed, fuel level, and engine temperature.</w:t>
       </w:r>
     </w:p>
@@ -1728,6 +1899,102 @@
         </w:rPr>
         <w:t>• In Transit (Stopped/Unscheduled): The percentage of your fleet actively flagged on the red security radar because they stopped on the highway shoulder.</w:t>
       </w:r>
+    </w:p>
+    <w:p>
+      <w:pPr>
+        <w:rPr>
+          <w:lang w:val="en-US"/>
+        </w:rPr>
+      </w:pPr>
+    </w:p>
+    <w:p>
+      <w:pPr>
+        <w:numPr>
+          <w:ilvl w:val="0"/>
+          <w:numId w:val="6"/>
+        </w:numPr>
+      </w:pPr>
+      <w:r>
+        <w:rPr>
+          <w:b/>
+          <w:bCs/>
+        </w:rPr>
+        <w:lastRenderedPageBreak/>
+        <w:t>Active Moving Delivery Vectors:</w:t>
+      </w:r>
+      <w:r>
+        <w:t xml:space="preserve"> This is data-science language for </w:t>
+      </w:r>
+      <w:r>
+        <w:rPr>
+          <w:b/>
+          <w:bCs/>
+        </w:rPr>
+        <w:t>"Trucks currently driving on the highway to deliver fuel."</w:t>
+      </w:r>
+    </w:p>
+    <w:p>
+      <w:pPr>
+        <w:numPr>
+          <w:ilvl w:val="0"/>
+          <w:numId w:val="6"/>
+        </w:numPr>
+      </w:pPr>
+      <w:r>
+        <w:rPr>
+          <w:b/>
+          <w:bCs/>
+        </w:rPr>
+        <w:t>12,234 Snapshots:</w:t>
+      </w:r>
+      <w:r>
+        <w:t xml:space="preserve"> Because your 1,300 trucks automatically text their speed and temperature data to your Neon database every 4 hours, your database has collected thousands of logs. This number means that </w:t>
+      </w:r>
+      <w:r>
+        <w:rPr>
+          <w:b/>
+          <w:bCs/>
+        </w:rPr>
+        <w:t>12,234 of those historical text messages</w:t>
+      </w:r>
+      <w:r>
+        <w:t xml:space="preserve"> were sent by trucks that were actively moving product.</w:t>
+      </w:r>
+    </w:p>
+    <w:p>
+      <w:pPr>
+        <w:numPr>
+          <w:ilvl w:val="0"/>
+          <w:numId w:val="6"/>
+        </w:numPr>
+      </w:pPr>
+      <w:r>
+        <w:rPr>
+          <w:b/>
+          <w:bCs/>
+        </w:rPr>
+        <w:t>Cruising Norm:</w:t>
+      </w:r>
+      <w:r>
+        <w:t xml:space="preserve"> This is the operational status label. It tells a logistics manager that these 12,234 check-ins represent </w:t>
+      </w:r>
+      <w:r>
+        <w:rPr>
+          <w:b/>
+          <w:bCs/>
+        </w:rPr>
+        <w:t>"business as usual"</w:t>
+      </w:r>
+      <w:r>
+        <w:t>—the trucks were driving at normal highway speeds, their engines were at a healthy temperature, and they were not breaking down or getting fuel stolen.</w:t>
+      </w:r>
+    </w:p>
+    <w:p>
+      <w:pPr>
+        <w:rPr>
+          <w:lang w:val="en-US"/>
+        </w:rPr>
+      </w:pPr>
     </w:p>
     <w:p/>
     <w:sectPr>
@@ -2041,6 +2308,155 @@
     </w:lvl>
   </w:abstractNum>
   <w:abstractNum w:abstractNumId="2" w15:restartNumberingAfterBreak="0">
+    <w:nsid w:val="42CA6E75"/>
+    <w:multiLevelType w:val="multilevel"/>
+    <w:tmpl w:val="ADF89130"/>
+    <w:lvl w:ilvl="0">
+      <w:start w:val="1"/>
+      <w:numFmt w:val="bullet"/>
+      <w:lvlText w:val=""/>
+      <w:lvlJc w:val="left"/>
+      <w:pPr>
+        <w:tabs>
+          <w:tab w:val="num" w:pos="720"/>
+        </w:tabs>
+        <w:ind w:left="720" w:hanging="360"/>
+      </w:pPr>
+      <w:rPr>
+        <w:rFonts w:ascii="Symbol" w:hAnsi="Symbol" w:hint="default"/>
+        <w:sz w:val="20"/>
+      </w:rPr>
+    </w:lvl>
+    <w:lvl w:ilvl="1" w:tentative="1">
+      <w:start w:val="1"/>
+      <w:numFmt w:val="bullet"/>
+      <w:lvlText w:val="o"/>
+      <w:lvlJc w:val="left"/>
+      <w:pPr>
+        <w:tabs>
+          <w:tab w:val="num" w:pos="1440"/>
+        </w:tabs>
+        <w:ind w:left="1440" w:hanging="360"/>
+      </w:pPr>
+      <w:rPr>
+        <w:rFonts w:ascii="Courier New" w:hAnsi="Courier New" w:hint="default"/>
+        <w:sz w:val="20"/>
+      </w:rPr>
+    </w:lvl>
+    <w:lvl w:ilvl="2" w:tentative="1">
+      <w:start w:val="1"/>
+      <w:numFmt w:val="bullet"/>
+      <w:lvlText w:val=""/>
+      <w:lvlJc w:val="left"/>
+      <w:pPr>
+        <w:tabs>
+          <w:tab w:val="num" w:pos="2160"/>
+        </w:tabs>
+        <w:ind w:left="2160" w:hanging="360"/>
+      </w:pPr>
+      <w:rPr>
+        <w:rFonts w:ascii="Wingdings" w:hAnsi="Wingdings" w:hint="default"/>
+        <w:sz w:val="20"/>
+      </w:rPr>
+    </w:lvl>
+    <w:lvl w:ilvl="3" w:tentative="1">
+      <w:start w:val="1"/>
+      <w:numFmt w:val="bullet"/>
+      <w:lvlText w:val=""/>
+      <w:lvlJc w:val="left"/>
+      <w:pPr>
+        <w:tabs>
+          <w:tab w:val="num" w:pos="2880"/>
+        </w:tabs>
+        <w:ind w:left="2880" w:hanging="360"/>
+      </w:pPr>
+      <w:rPr>
+        <w:rFonts w:ascii="Wingdings" w:hAnsi="Wingdings" w:hint="default"/>
+        <w:sz w:val="20"/>
+      </w:rPr>
+    </w:lvl>
+    <w:lvl w:ilvl="4" w:tentative="1">
+      <w:start w:val="1"/>
+      <w:numFmt w:val="bullet"/>
+      <w:lvlText w:val=""/>
+      <w:lvlJc w:val="left"/>
+      <w:pPr>
+        <w:tabs>
+          <w:tab w:val="num" w:pos="3600"/>
+        </w:tabs>
+        <w:ind w:left="3600" w:hanging="360"/>
+      </w:pPr>
+      <w:rPr>
+        <w:rFonts w:ascii="Wingdings" w:hAnsi="Wingdings" w:hint="default"/>
+        <w:sz w:val="20"/>
+      </w:rPr>
+    </w:lvl>
+    <w:lvl w:ilvl="5" w:tentative="1">
+      <w:start w:val="1"/>
+      <w:numFmt w:val="bullet"/>
+      <w:lvlText w:val=""/>
+      <w:lvlJc w:val="left"/>
+      <w:pPr>
+        <w:tabs>
+          <w:tab w:val="num" w:pos="4320"/>
+        </w:tabs>
+        <w:ind w:left="4320" w:hanging="360"/>
+      </w:pPr>
+      <w:rPr>
+        <w:rFonts w:ascii="Wingdings" w:hAnsi="Wingdings" w:hint="default"/>
+        <w:sz w:val="20"/>
+      </w:rPr>
+    </w:lvl>
+    <w:lvl w:ilvl="6" w:tentative="1">
+      <w:start w:val="1"/>
+      <w:numFmt w:val="bullet"/>
+      <w:lvlText w:val=""/>
+      <w:lvlJc w:val="left"/>
+      <w:pPr>
+        <w:tabs>
+          <w:tab w:val="num" w:pos="5040"/>
+        </w:tabs>
+        <w:ind w:left="5040" w:hanging="360"/>
+      </w:pPr>
+      <w:rPr>
+        <w:rFonts w:ascii="Wingdings" w:hAnsi="Wingdings" w:hint="default"/>
+        <w:sz w:val="20"/>
+      </w:rPr>
+    </w:lvl>
+    <w:lvl w:ilvl="7" w:tentative="1">
+      <w:start w:val="1"/>
+      <w:numFmt w:val="bullet"/>
+      <w:lvlText w:val=""/>
+      <w:lvlJc w:val="left"/>
+      <w:pPr>
+        <w:tabs>
+          <w:tab w:val="num" w:pos="5760"/>
+        </w:tabs>
+        <w:ind w:left="5760" w:hanging="360"/>
+      </w:pPr>
+      <w:rPr>
+        <w:rFonts w:ascii="Wingdings" w:hAnsi="Wingdings" w:hint="default"/>
+        <w:sz w:val="20"/>
+      </w:rPr>
+    </w:lvl>
+    <w:lvl w:ilvl="8" w:tentative="1">
+      <w:start w:val="1"/>
+      <w:numFmt w:val="bullet"/>
+      <w:lvlText w:val=""/>
+      <w:lvlJc w:val="left"/>
+      <w:pPr>
+        <w:tabs>
+          <w:tab w:val="num" w:pos="6480"/>
+        </w:tabs>
+        <w:ind w:left="6480" w:hanging="360"/>
+      </w:pPr>
+      <w:rPr>
+        <w:rFonts w:ascii="Wingdings" w:hAnsi="Wingdings" w:hint="default"/>
+        <w:sz w:val="20"/>
+      </w:rPr>
+    </w:lvl>
+  </w:abstractNum>
+  <w:abstractNum w:abstractNumId="3" w15:restartNumberingAfterBreak="0">
     <w:nsid w:val="443C667D"/>
     <w:multiLevelType w:val="multilevel"/>
     <w:tmpl w:val="124EB312"/>
@@ -2153,7 +2569,7 @@
       </w:pPr>
     </w:lvl>
   </w:abstractNum>
-  <w:abstractNum w:abstractNumId="3" w15:restartNumberingAfterBreak="0">
+  <w:abstractNum w:abstractNumId="4" w15:restartNumberingAfterBreak="0">
     <w:nsid w:val="5D460C18"/>
     <w:multiLevelType w:val="multilevel"/>
     <w:tmpl w:val="46FA6528"/>
@@ -2302,7 +2718,7 @@
       </w:rPr>
     </w:lvl>
   </w:abstractNum>
-  <w:abstractNum w:abstractNumId="4" w15:restartNumberingAfterBreak="0">
+  <w:abstractNum w:abstractNumId="5" w15:restartNumberingAfterBreak="0">
     <w:nsid w:val="65500ABD"/>
     <w:multiLevelType w:val="multilevel"/>
     <w:tmpl w:val="5504F858"/>
@@ -2455,16 +2871,19 @@
     <w:abstractNumId w:val="0"/>
   </w:num>
   <w:num w:numId="2" w16cid:durableId="659503185">
+    <w:abstractNumId w:val="4"/>
+  </w:num>
+  <w:num w:numId="3" w16cid:durableId="725026769">
     <w:abstractNumId w:val="3"/>
   </w:num>
-  <w:num w:numId="3" w16cid:durableId="725026769">
-    <w:abstractNumId w:val="2"/>
-  </w:num>
   <w:num w:numId="4" w16cid:durableId="2051763816">
-    <w:abstractNumId w:val="4"/>
+    <w:abstractNumId w:val="5"/>
   </w:num>
   <w:num w:numId="5" w16cid:durableId="1425954597">
     <w:abstractNumId w:val="1"/>
+  </w:num>
+  <w:num w:numId="6" w16cid:durableId="819729874">
+    <w:abstractNumId w:val="2"/>
   </w:num>
 </w:numbering>
 </file>
@@ -3072,7 +3491,6 @@
   <w:style w:type="character" w:default="1" w:styleId="DefaultParagraphFont">
     <w:name w:val="Default Paragraph Font"/>
     <w:uiPriority w:val="1"/>
-    <w:semiHidden/>
     <w:unhideWhenUsed/>
   </w:style>
   <w:style w:type="table" w:default="1" w:styleId="TableNormal">

</xml_diff>